<commit_message>
try to fix bug
</commit_message>
<xml_diff>
--- a/document_templates/Contracts/individual_business/contract_individual_business.docx
+++ b/document_templates/Contracts/individual_business/contract_individual_business.docx
@@ -109,8 +109,6 @@
         </w:rPr>
         <w:t>TG-LFW-01-2022-44-0713, Agrément Numéro 36/MF/SG/CAS-IMEC et inscrite sur la liste de l’APSFD sous le numéro T/1/GFLM/2019/257A</w:t>
       </w:r>
-      <w:bookmarkStart w:id="10" w:name="_GoBack"/>
-      <w:bookmarkEnd w:id="10"/>
       <w:r>
         <w:rPr>
           <w:rFonts w:hint="default" w:ascii="Times New Roman" w:hAnsi="Times New Roman" w:cs="Times New Roman"/>
@@ -4175,6 +4173,7 @@
         <w:jc w:val="both"/>
         <w:rPr>
           <w:rFonts w:hint="default" w:ascii="Times New Roman" w:hAnsi="Times New Roman" w:cs="Times New Roman"/>
+          <w:b/>
           <w:sz w:val="24"/>
           <w:szCs w:val="24"/>
           <w:highlight w:val="none"/>
@@ -4192,24 +4191,42 @@
     </w:p>
     <w:p>
       <w:pPr>
-        <w:rPr>
-          <w:rFonts w:hint="default" w:ascii="Times New Roman" w:hAnsi="Times New Roman" w:cs="Times New Roman"/>
-          <w:b/>
-          <w:sz w:val="24"/>
-          <w:szCs w:val="24"/>
-          <w:highlight w:val="none"/>
-        </w:rPr>
-      </w:pPr>
-      <w:r>
-        <w:rPr>
-          <w:rFonts w:hint="default" w:ascii="Times New Roman" w:hAnsi="Times New Roman" w:cs="Times New Roman"/>
-          <w:b/>
-          <w:sz w:val="24"/>
-          <w:szCs w:val="24"/>
-          <w:highlight w:val="none"/>
-        </w:rPr>
-        <w:br w:type="page"/>
-      </w:r>
+        <w:spacing w:line="240" w:lineRule="auto"/>
+        <w:jc w:val="both"/>
+        <w:rPr>
+          <w:rFonts w:ascii="Times New Roman" w:hAnsi="Times New Roman"/>
+          <w:b/>
+          <w:bCs/>
+          <w:sz w:val="24"/>
+          <w:szCs w:val="24"/>
+        </w:rPr>
+      </w:pPr>
+    </w:p>
+    <w:p>
+      <w:pPr>
+        <w:spacing w:line="240" w:lineRule="auto"/>
+        <w:jc w:val="both"/>
+        <w:rPr>
+          <w:rFonts w:ascii="Times New Roman" w:hAnsi="Times New Roman"/>
+          <w:b/>
+          <w:bCs/>
+          <w:sz w:val="24"/>
+          <w:szCs w:val="24"/>
+        </w:rPr>
+      </w:pPr>
+    </w:p>
+    <w:p>
+      <w:pPr>
+        <w:spacing w:line="240" w:lineRule="auto"/>
+        <w:jc w:val="both"/>
+        <w:rPr>
+          <w:rFonts w:ascii="Times New Roman" w:hAnsi="Times New Roman"/>
+          <w:b/>
+          <w:bCs/>
+          <w:sz w:val="24"/>
+          <w:szCs w:val="24"/>
+        </w:rPr>
+      </w:pPr>
     </w:p>
     <w:p>
       <w:pPr>
@@ -5351,9 +5368,9 @@
         <w:jc w:val="both"/>
         <w:rPr>
           <w:rFonts w:hint="default" w:ascii="Times New Roman" w:hAnsi="Times New Roman" w:cs="Times New Roman"/>
-          <w:sz w:val="24"/>
-          <w:szCs w:val="24"/>
-          <w:highlight w:val="none"/>
+          <w:b/>
+          <w:sz w:val="24"/>
+          <w:szCs w:val="24"/>
         </w:rPr>
       </w:pPr>
       <w:r>
@@ -5365,25 +5382,8 @@
         </w:rPr>
         <w:t xml:space="preserve">                                                                                                  En Trois (03) exemplaires </w:t>
       </w:r>
-    </w:p>
-    <w:p>
-      <w:pPr>
-        <w:rPr>
-          <w:rFonts w:hint="default" w:ascii="Times New Roman" w:hAnsi="Times New Roman" w:cs="Times New Roman"/>
-          <w:b/>
-          <w:sz w:val="24"/>
-          <w:szCs w:val="24"/>
-        </w:rPr>
-      </w:pPr>
-      <w:r>
-        <w:rPr>
-          <w:rFonts w:hint="default" w:ascii="Times New Roman" w:hAnsi="Times New Roman" w:cs="Times New Roman"/>
-          <w:b/>
-          <w:sz w:val="24"/>
-          <w:szCs w:val="24"/>
-        </w:rPr>
-        <w:br w:type="page"/>
-      </w:r>
+      <w:bookmarkStart w:id="10" w:name="_GoBack"/>
+      <w:bookmarkEnd w:id="10"/>
     </w:p>
     <w:p>
       <w:pPr>

</xml_diff>